<commit_message>
Your First Book That Sells and YouTube companion: 2026 fact audit, KDP listings, leftovers to bak
Book: 70% band to 12.99 USD since 7 Jul 2026, paperback 50/60% split, Select-only 70% in BR/JP/MX/IN, Countdown rules, KU fund July 2026, KDP AI-generated vs AI-assisted wording, 2-titles-per-format weekly limit, DRM-free EPUB/PDF downloads; subtitle hyphenated; docx metadata. 8,252 -> 8,705 words.

YouTube: YPP changes from 1 Feb 2027 (8,000 h / 20M Shorts for new applicants, 10M/90d floor for Shorts pool, activity rule), 55/45 shares, AI disclosure details, inauthentic-content and AI-persona rules, glossary. 28,520 -> 29,363 words.

Superseded drafts, old builder, one-off scripts and the stale double-spaced How to Pubish duplicate moved to untracked bak folders.
</commit_message>
<xml_diff>
--- a/Your First Book That Sells/First_Review_Kindle_Edition/Your_First_Book_That_Sells_Updated.docx
+++ b/Your First Book That Sells/First_Review_Kindle_Edition/Your_First_Book_That_Sells_Updated.docx
@@ -17,7 +17,7 @@
         <w:pStyle w:val="Subtitle"/>
       </w:pPr>
       <w:r>
-        <w:t>How to Self Publish on Kindle, Attract Honest Reviews, and Build a Profitable Book Catalog</w:t>
+        <w:t>How to Self-Publish on Kindle, Attract Honest Reviews, and Build a Profitable Book Catalog</w:t>
       </w:r>
     </w:p>
     <w:p>
@@ -27,7 +27,7 @@
     </w:p>
     <w:p>
       <w:r>
-        <w:t>Updated 30 September 2026</w:t>
+        <w:t>Updated 1 October 2026</w:t>
       </w:r>
     </w:p>
     <w:p>
@@ -57,7 +57,7 @@
     </w:p>
     <w:p>
       <w:r>
-        <w:t>Every dollar figure is marked. A teaching example is a made-up sum so you can practice the arithmetic. A platform rule is something Amazon published, checked here on 27 September 2026. Recheck the linked page before you rely on it. Nothing in this book is a promise that you will earn a stated amount.</w:t>
+        <w:t>Every dollar figure is marked. A teaching example is a made-up sum so you can practice the arithmetic. A platform rule is something Amazon published, checked here on 1 October 2026. Recheck the linked page before you rely on it. Nothing in this book is a promise that you will earn a stated amount.</w:t>
       </w:r>
     </w:p>
     <w:p>
@@ -517,7 +517,7 @@
     </w:p>
     <w:p>
       <w:r>
-        <w:t>On Amazon.com, as checked on 27 September 2026, the usual 70 percent ebook band is $2.99 to $12.99. Price is only one rule. Territory and other requirements matter. Read the current price page, and read the estimate in your own KDP account, before you publish. [3]</w:t>
+        <w:t>On Amazon.com, as checked on 1 October 2026, the usual 70 percent ebook band is $2.99 to $12.99. Until 7 July 2026 the top of that band was $9.99, so older advice that tells you to stop at $9.99 is out of date. Price is only one rule. Territory and other requirements matter. Sales to readers in Brazil, Japan, Mexico, and India earn 70 percent only if the ebook is enrolled in KDP Select. Read the current price page, and read the estimate in your own KDP account, before you publish. [3] [4]</w:t>
       </w:r>
     </w:p>
     <w:p>
@@ -537,7 +537,7 @@
     </w:p>
     <w:p>
       <w:r>
-        <w:t>Amazon.com listed delivery at $0.15 per megabyte, using Amazon’s file size, not the size of the Word file on your desk. A 2 MB file is $0.30 of delivery. A picture-heavy book can be much larger. Use KDP’s estimate for the converted file.</w:t>
+        <w:t>Amazon.com lists delivery at $0.15 per megabyte, using Amazon’s file size, not the size of the Word file on your desk. A 2 MB file is $0.30 of delivery. A picture-heavy book can be much larger. Use KDP’s estimate for the converted file.</w:t>
       </w:r>
     </w:p>
     <w:p>
@@ -623,12 +623,12 @@
     </w:p>
     <w:p>
       <w:r>
-        <w:t>A paperback is a different sum. For a standard KDP paperback, you take the royalty rate times the list price, then subtract the printing cost. The print cost is not multiplied by the rate. [7]</w:t>
-      </w:r>
-    </w:p>
-    <w:p>
-      <w:r>
-        <w:t>Teaching example only, not a quote for your book. A $14.99 paperback at a 60 percent rate, with a $4 print cost, keeps (0.60 × $14.99) − $4, about $5.00. Your trim size, page count, and marketplace change the print cost. Use the calculator. Do not publish a paperback price you have not run through it.</w:t>
+        <w:t>A paperback is a different sum. For a standard KDP paperback, you take the royalty rate times the list price, then subtract the printing cost. The print cost is not multiplied by the rate. On Amazon.com the rate is 60 percent at a list price of $9.99 or more, and 50 percent at $9.98 or less. Other marketplaces have their own dividing line. [7]</w:t>
+      </w:r>
+    </w:p>
+    <w:p>
+      <w:r>
+        <w:t>Teaching example only, not a quote for your book. A $14.99 paperback at a 60 percent rate, with a $4 print cost, keeps (0.60 × $14.99) − $4, about $5.00. The same book at $8.99 drops to the 50 percent rate and keeps (0.50 × $8.99) − $4, about $0.50. Your trim size, page count, and marketplace change the print cost. Use the calculator. Do not publish a paperback price you have not run through it.</w:t>
       </w:r>
     </w:p>
     <w:p>
@@ -787,7 +787,7 @@
     </w:p>
     <w:p>
       <w:r>
-        <w:t>Keywords are the phrases a reader types. On the KDP details page you get a set of keyword boxes. Fill them with phrases, not single vague words like “book” or “fiction.” Use words a reader would type, the way June’s phrases are words from the titles in chapter 2. Do not repeat the title in every box. Do not type claims you cannot stand behind, such as “bestseller” or “guaranteed income.” If the form on the page has changed since 27 September 2026, follow the form, not this paragraph.</w:t>
+        <w:t>Keywords are the phrases a reader types. On the KDP details page you get a set of keyword boxes. Fill them with phrases, not single vague words like “book” or “fiction.” Use words a reader would type, the way June’s phrases are words from the titles in chapter 2. Do not repeat the title in every box. Do not type claims you cannot stand behind, such as “bestseller” or “guaranteed income.” If the form on the page has changed since 1 October 2026, follow the form, not this paragraph.</w:t>
       </w:r>
     </w:p>
     <w:p>
@@ -1247,7 +1247,7 @@
     </w:p>
     <w:p>
       <w:r>
-        <w:t>Select is 90 days. Page reads may pay you. The ebook stays out of other stores. You cannot lay a page read next to a $2.58 sale with the numbers in this book. The rate is in your reports. [5]</w:t>
+        <w:t>Select is 90 days. Page reads may pay you. The ebook stays out of other stores. Amazon announces a fund each month and splits it across every page read in Kindle Unlimited. For July 2026 the fund was $67.6 million. Authors who track the payouts reported a per-page rate for that month of a little over four tenths of a cent, so a full read of a book that counts as 300 pages paid roughly $1.27. That is history, not a promise. The rate moves every month, and your own reports are the only number that counts for your book. [5] [10]</w:t>
       </w:r>
     </w:p>
     <w:p>
@@ -1270,12 +1270,12 @@
     </w:p>
     <w:p>
       <w:r>
-        <w:t>A countdown is a visit. The everyday price is the business. A qualifying countdown can sometimes keep 70 percent below $2.99. Check the rules. [6]</w:t>
-      </w:r>
-    </w:p>
-    <w:p>
-      <w:r>
-        <w:t>Smallest version: a few days, and the morning the full price returns written on the sheet.</w:t>
+        <w:t>A countdown is a visit. The everyday price is the business. A countdown runs only on Amazon.com and Amazon.co.uk, only after the book has been in Select for 30 days, and for seven days at most. If the book is on the 70 percent option, it keeps 70 percent during the deal even below $2.99, with delivery still taken off. The list price must stay unchanged for 30 days before and 14 days after. [6]</w:t>
+      </w:r>
+    </w:p>
+    <w:p>
+      <w:r>
+        <w:t>Smallest version: a few days, one deal in the 90-day term, and the morning the full price returns written on the sheet.</w:t>
       </w:r>
     </w:p>
     <w:p>
@@ -2139,7 +2139,7 @@
     </w:p>
     <w:p>
       <w:r>
-        <w:t>Two weeks before. Read the ebook on your phone. Check headings, pictures, and the live price rules again. Do not send a review link before reviews can be posted.</w:t>
+        <w:t>Two weeks before. Read the ebook on your phone. Check headings, pictures, and the live price rules again. Create the KDP entries now if you have other books launching the same week, because KDP allows only two new titles per format each week. Do not send a review link before reviews can be posted.</w:t>
       </w:r>
     </w:p>
     <w:p>
@@ -2623,7 +2623,12 @@
     </w:p>
     <w:p>
       <w:r>
-        <w:t>If text or images were generated and you then edited them, answer KDP’s AI question for what you actually did. Help with spelling is not the same as a generated book. [8]</w:t>
+        <w:t>KDP asks about AI each time you publish a new book or republish an edited one. Answer for what you actually did. Amazon’s rule has two sides. If an AI tool wrote the text, made the cover or an interior picture, or did the translation, that is AI-generated, and you must say so even if you edited it heavily afterwards. If you wrote it and used a tool to check spelling, tighten sentences, or brainstorm ideas, that is AI-assisted, and you do not have to say so. Either way you are responsible for the content, including its rights. [8]</w:t>
+      </w:r>
+    </w:p>
+    <w:p>
+      <w:r>
+        <w:t>Two more 2026 rules belong on the same checklist. Since 21 September 2026, KDP lets you create only two new titles per format each week: two ebooks, two paperbacks, and two hardcovers, reset every Sunday at midnight UTC. A book in three formats uses one slot in each. Editing a live book does not count. Plan the launch week around it. [11] And the DRM box now matters more. Since 20 January 2026, if you publish without DRM, a verified buyer can download the book as EPUB and PDF. Choose that on purpose. [12]</w:t>
       </w:r>
     </w:p>
     <w:p>
@@ -2658,7 +2663,7 @@
     </w:p>
     <w:p>
       <w:r>
-        <w:t>Countdown. A short, scheduled price cut that may keep the 70 percent rate below $2.99 if you qualify. Idea 9 in chapter 8. [6]</w:t>
+        <w:t>Countdown. A short, scheduled price cut, up to seven days, for books in KDP Select on Amazon.com and Amazon.co.uk. It keeps the 70 percent rate below $2.99 if the book is on that option. Idea 9 in chapter 8. [6]</w:t>
       </w:r>
     </w:p>
     <w:p>
@@ -2683,7 +2688,7 @@
     </w:p>
     <w:p>
       <w:r>
-        <w:t>Seventy percent band. On Amazon.com, as checked on 27 September 2026, the usual ebook prices from $2.99 to $12.99 where a 70 percent royalty can apply. Chapter 3. [3]</w:t>
+        <w:t>Seventy percent band. On Amazon.com, as checked on 1 October 2026, the usual ebook prices from $2.99 to $12.99 where a 70 percent royalty can apply. The top was $9.99 until 7 July 2026. Chapter 3. [3]</w:t>
       </w:r>
     </w:p>
     <w:p>
@@ -2703,7 +2708,7 @@
     </w:p>
     <w:p>
       <w:r>
-        <w:t>These links support the platform rules named above. The thirty-two ideas, the sample months, and the rounded keeps are teaching tools, not Amazon rules. Checked 27 September 2026. Look again before you publish.</w:t>
+        <w:t>These links support the platform rules named above. The thirty-two ideas, the sample months, and the rounded keeps are teaching tools, not Amazon rules. Checked 1 October 2026. Look again before you publish.</w:t>
       </w:r>
     </w:p>
     <w:p>
@@ -2794,6 +2799,36 @@
     <w:p>
       <w:r>
         <w:t>https://kdp.amazon.com/en_US/help/topic/GU72M65VRFPH43L6</w:t>
+      </w:r>
+    </w:p>
+    <w:p>
+      <w:r>
+        <w:t>[10] KDP Select Global Fund and All Stars Bonus Update, July 2026</w:t>
+      </w:r>
+    </w:p>
+    <w:p>
+      <w:r>
+        <w:t>https://www.kdpcommunity.com/s/article/KDP-Select-Global-Fund-and-All-Stars-Bonus-Update---July-2026</w:t>
+      </w:r>
+    </w:p>
+    <w:p>
+      <w:r>
+        <w:t>[11] Amazon KDP Create a Book (title creation limit)</w:t>
+      </w:r>
+    </w:p>
+    <w:p>
+      <w:r>
+        <w:t>https://kdp.amazon.com/en_US/help/topic/G202172740</w:t>
+      </w:r>
+    </w:p>
+    <w:p>
+      <w:r>
+        <w:t>[12] Amazon KDP Digital Rights Management</w:t>
+      </w:r>
+    </w:p>
+    <w:p>
+      <w:r>
+        <w:t>https://kdp.amazon.com/en_US/help/topic/GDDXGH9VR22ACM8U</w:t>
       </w:r>
     </w:p>
     <w:p>

</xml_diff>